<commit_message>
Página Da mesma coleção nos três livros; capítulo 2 de De mulher para mulher equilibrado (Efésios 5)
Co-Authored-By: Claude Opus 5.5 <noreply@anthropic.com>
Claude-Session: https://claude.ai/code/session_01LzW95iq837pNNELpWoCBLT
</commit_message>
<xml_diff>
--- a/livros/de-mulher-para-mulher/De-mulher-para-mulher.docx
+++ b/livros/de-mulher-para-mulher/De-mulher-para-mulher.docx
@@ -1312,6 +1312,76 @@
         <w:pStyle w:val="BodyText"/>
       </w:pPr>
       <w:r>
+        <w:t xml:space="preserve">Mas deixe que eu complete o pensamento, querida, porque a Bíblia também diz outra coisa, e eu não quero lhe contar só a metade.</w:t>
+      </w:r>
+    </w:p>
+    <w:p>
+      <w:pPr>
+        <w:pStyle w:val="BodyText"/>
+      </w:pPr>
+      <w:r>
+        <w:t xml:space="preserve">Igual em valor não quer dizer igual em tudo. Deus fez Adão primeiro e lhe deu a ordem sobre a árvore antes de eu existir (Gênesis 2:15-17). Muito tempo depois, Paulo ensinaria que o marido é chamado a ser o cabeça do lar, e que a esposa é chamada a respeitá-lo (Efésios 5:23, 33). Eu entendo hoje que isso não diminui a mulher. É uma ordem que Deus colocou no casamento, assim como colocou ordem em toda a criação.</w:t>
+      </w:r>
+    </w:p>
+    <w:p>
+      <w:pPr>
+        <w:pStyle w:val="BodyText"/>
+      </w:pPr>
+      <w:r>
+        <w:t xml:space="preserve">Repare, porém, em que tipo de cabeça Paulo está falando. O modelo é Cristo, que amou a igreja</w:t>
+      </w:r>
+      <w:r>
+        <w:t xml:space="preserve"> </w:t>
+      </w:r>
+      <w:r>
+        <w:rPr>
+          <w:iCs/>
+          <w:i/>
+        </w:rPr>
+        <w:t xml:space="preserve">“</w:t>
+      </w:r>
+      <w:r>
+        <w:rPr>
+          <w:iCs/>
+          <w:i/>
+        </w:rPr>
+        <w:t xml:space="preserve">e a si mesmo se entregou por ela</w:t>
+      </w:r>
+      <w:r>
+        <w:rPr>
+          <w:iCs/>
+          <w:i/>
+        </w:rPr>
+        <w:t xml:space="preserve">”</w:t>
+      </w:r>
+      <w:r>
+        <w:t xml:space="preserve"> </w:t>
+      </w:r>
+      <w:r>
+        <w:t xml:space="preserve">(Efésios 5:25). A liderança que Deus pede ao marido não é a de quem manda e é servido. É a de quem serve primeiro, protege, se sacrifica e assume a responsabilidade. Naquela tarde no jardim, o que faltou a Adão não foi poder sobre mim. Foi coragem para estar ao meu lado e lembrar a palavra de Deus quando eu precisei.</w:t>
+      </w:r>
+    </w:p>
+    <w:p>
+      <w:pPr>
+        <w:pStyle w:val="BodyText"/>
+      </w:pPr>
+      <w:r>
+        <w:t xml:space="preserve">E o respeito que Deus pede à esposa também não é medo, nem silêncio diante do que é errado. É honrar o marido, apoiá-lo, ajudá-lo a ser o homem que Deus quer, como auxiliadora que corresponde a ele, face a face.</w:t>
+      </w:r>
+    </w:p>
+    <w:p>
+      <w:pPr>
+        <w:pStyle w:val="BodyText"/>
+      </w:pPr>
+      <w:r>
+        <w:t xml:space="preserve">Valor igual, papéis que se completam, e o amor de Cristo como medida para os dois. Era esse o projeto de Deus antes do estrago. E é para esse projeto que Ele quer devolver os casamentos.</w:t>
+      </w:r>
+    </w:p>
+    <w:p>
+      <w:pPr>
+        <w:pStyle w:val="BodyText"/>
+      </w:pPr>
+      <w:r>
         <w:t xml:space="preserve">Quero lhe contar também como eram as nossas conversas naqueles primeiros dias, porque acho que nelas há um segredo.</w:t>
       </w:r>
     </w:p>
@@ -8949,7 +9019,7 @@
         <w:pStyle w:val="Compact"/>
       </w:pPr>
       <w:r>
-        <w:t xml:space="preserve">Gênesis 2:18-25 — a criação da mulher, o poema de Adão e a união do casal</w:t>
+        <w:t xml:space="preserve">Gênesis 2:15-25 — a ordem dada a Adão, a criação da mulher, o poema de Adão e a união do casal</w:t>
       </w:r>
     </w:p>
     <w:p>
@@ -9213,7 +9283,7 @@
         <w:pStyle w:val="Compact"/>
       </w:pPr>
       <w:r>
-        <w:t xml:space="preserve">Efésios 2:10; 4:26, 32; 5:25; 6:4 — feitura de Deus, a ira e o perdão, o amor do marido, criar os filhos</w:t>
+        <w:t xml:space="preserve">Efésios 2:10; 4:26, 32; 5:23, 25, 33; 6:4 — feitura de Deus, a ira e o perdão, o marido como cabeça que ama e se entrega, o respeito da esposa, criar os filhos</w:t>
       </w:r>
     </w:p>
     <w:p>

</xml_diff>

<commit_message>
De mulher para mulher: ajustes da revisão do trecho sobre auxiliadora (Efésios 5)
Co-Authored-By: Claude Opus 5.5 <noreply@anthropic.com>
Claude-Session: https://claude.ai/code/session_01LzW95iq837pNNELpWoCBLT
</commit_message>
<xml_diff>
--- a/livros/de-mulher-para-mulher/De-mulher-para-mulher.docx
+++ b/livros/de-mulher-para-mulher/De-mulher-para-mulher.docx
@@ -1320,15 +1320,15 @@
         <w:pStyle w:val="BodyText"/>
       </w:pPr>
       <w:r>
-        <w:t xml:space="preserve">Igual em valor não quer dizer igual em tudo. Deus fez Adão primeiro e lhe deu a ordem sobre a árvore antes de eu existir (Gênesis 2:15-17). Muito tempo depois, Paulo ensinaria que o marido é chamado a ser o cabeça do lar, e que a esposa é chamada a respeitá-lo (Efésios 5:23, 33). Eu entendo hoje que isso não diminui a mulher. É uma ordem que Deus colocou no casamento, assim como colocou ordem em toda a criação.</w:t>
-      </w:r>
-    </w:p>
-    <w:p>
-      <w:pPr>
-        <w:pStyle w:val="BodyText"/>
-      </w:pPr>
-      <w:r>
-        <w:t xml:space="preserve">Repare, porém, em que tipo de cabeça Paulo está falando. O modelo é Cristo, que amou a igreja</w:t>
+        <w:t xml:space="preserve">Igual em valor não quer dizer igual em tudo. Deus fez Adão primeiro e lhe deu o mandamento sobre a árvore antes de eu existir (Gênesis 2:15-17), como o próprio Paulo lembraria (1 Timóteo 2:13). Muito tempo depois, ele ensinaria que o marido é o cabeça da mulher, como Cristo é o cabeça da igreja, e que a esposa deve respeitá-lo (Efésios 5:23, 33). Eu entendo hoje que isso não diminui a mulher. É uma ordem que Deus colocou no casamento, assim como colocou ordem em toda a criação.</w:t>
+      </w:r>
+    </w:p>
+    <w:p>
+      <w:pPr>
+        <w:pStyle w:val="BodyText"/>
+      </w:pPr>
+      <w:r>
+        <w:t xml:space="preserve">Antes de falar a cada um, Paulo pede que todos se sujeitem uns aos outros no temor de Cristo (Efésios 5:21). E repare em que tipo de cabeça ele está falando. O modelo é Cristo, que amou a igreja</w:t>
       </w:r>
       <w:r>
         <w:t xml:space="preserve"> </w:t>
@@ -1358,7 +1358,7 @@
         <w:t xml:space="preserve"> </w:t>
       </w:r>
       <w:r>
-        <w:t xml:space="preserve">(Efésios 5:25). A liderança que Deus pede ao marido não é a de quem manda e é servido. É a de quem serve primeiro, protege, se sacrifica e assume a responsabilidade. Naquela tarde no jardim, o que faltou a Adão não foi poder sobre mim. Foi coragem para estar ao meu lado e lembrar a palavra de Deus quando eu precisei.</w:t>
+        <w:t xml:space="preserve">(Efésios 5:25). A liderança que Deus pede ao marido não é a de quem manda e é servido. É a de quem serve primeiro, protege, se sacrifica e assume a responsabilidade. Naquela tarde no jardim, o que faltou a Adão não foi poder sobre mim. Foi coragem para falar, para lembrar a palavra de Deus que ele tinha ouvido primeiro. E a mim faltou chamá-lo e perguntar. Nós dois nos calamos.</w:t>
       </w:r>
     </w:p>
     <w:p>
@@ -1555,37 +1555,7 @@
         <w:pStyle w:val="BodyText"/>
       </w:pPr>
       <w:r>
-        <w:t xml:space="preserve">Paulo, escrevendo à igreja de Éfeso, mostrou como deveria ser o amor de um marido:</w:t>
-      </w:r>
-      <w:r>
-        <w:t xml:space="preserve"> </w:t>
-      </w:r>
-      <w:r>
-        <w:rPr>
-          <w:iCs/>
-          <w:i/>
-        </w:rPr>
-        <w:t xml:space="preserve">“</w:t>
-      </w:r>
-      <w:r>
-        <w:rPr>
-          <w:iCs/>
-          <w:i/>
-        </w:rPr>
-        <w:t xml:space="preserve">Maridos, amai vossa mulher, como também Cristo amou a igreja e a si mesmo se entregou por ela</w:t>
-      </w:r>
-      <w:r>
-        <w:rPr>
-          <w:iCs/>
-          <w:i/>
-        </w:rPr>
-        <w:t xml:space="preserve">”</w:t>
-      </w:r>
-      <w:r>
-        <w:t xml:space="preserve"> </w:t>
-      </w:r>
-      <w:r>
-        <w:t xml:space="preserve">(Efésios 5:25). E Pedro lembrou aos maridos que tratassem as esposas com dignidade, porque são, junto com eles, herdeiras da mesma graça da vida (1 Pedro 3:7). A mesma graça. O mesmo valor diante de Deus.</w:t>
+        <w:t xml:space="preserve">Paulo, como eu já lhe disse, pediu aos maridos que amassem como Cristo amou a igreja (Efésios 5:25). E Pedro lembrou aos maridos que tratassem as esposas com dignidade, porque são, junto com eles, herdeiras da mesma graça da vida (1 Pedro 3:7). A mesma graça. O mesmo valor diante de Deus.</w:t>
       </w:r>
     </w:p>
     <w:p>
@@ -9283,7 +9253,7 @@
         <w:pStyle w:val="Compact"/>
       </w:pPr>
       <w:r>
-        <w:t xml:space="preserve">Efésios 2:10; 4:26, 32; 5:23, 25, 33; 6:4 — feitura de Deus, a ira e o perdão, o marido como cabeça que ama e se entrega, o respeito da esposa, criar os filhos</w:t>
+        <w:t xml:space="preserve">Efésios 2:10; 4:26, 32; 5:21, 23, 25, 33; 6:4 — feitura de Deus, a ira e o perdão, a sujeição mútua, o marido como cabeça que ama e se entrega, o respeito da esposa, criar os filhos</w:t>
       </w:r>
     </w:p>
     <w:p>
@@ -9320,6 +9290,18 @@
       </w:pPr>
       <w:r>
         <w:t xml:space="preserve">1 Tessalonicenses 4:13 — a tristeza com esperança</w:t>
+      </w:r>
+    </w:p>
+    <w:p>
+      <w:pPr>
+        <w:numPr>
+          <w:ilvl w:val="0"/>
+          <w:numId w:val="1001"/>
+        </w:numPr>
+        <w:pStyle w:val="Compact"/>
+      </w:pPr>
+      <w:r>
+        <w:t xml:space="preserve">1 Timóteo 2:13 — Adão foi formado primeiro</w:t>
       </w:r>
     </w:p>
     <w:p>

</xml_diff>

<commit_message>
Bibliografias com edições brasileiras encontradas; fonte real da citação de Corrie ten Boom
Co-Authored-By: Claude Opus 5.5 <noreply@anthropic.com>
Claude-Session: https://claude.ai/code/session_01LzW95iq837pNNELpWoCBLT
</commit_message>
<xml_diff>
--- a/livros/de-mulher-para-mulher/De-mulher-para-mulher.docx
+++ b/livros/de-mulher-para-mulher/De-mulher-para-mulher.docx
@@ -4470,17 +4470,23 @@
         <w:t xml:space="preserve"> </w:t>
       </w:r>
       <w:r>
-        <w:t xml:space="preserve">— Corrie ten Boom,</w:t>
-      </w:r>
-      <w:r>
-        <w:t xml:space="preserve"> </w:t>
-      </w:r>
-      <w:r>
-        <w:rPr>
-          <w:iCs/>
-          <w:i/>
-        </w:rPr>
-        <w:t xml:space="preserve">Ainda aprendendo a perdoar</w:t>
+        <w:t xml:space="preserve">— Corrie ten Boom, relato na revista</w:t>
+      </w:r>
+      <w:r>
+        <w:t xml:space="preserve"> </w:t>
+      </w:r>
+      <w:r>
+        <w:rPr>
+          <w:iCs/>
+          <w:i/>
+        </w:rPr>
+        <w:t xml:space="preserve">Guideposts</w:t>
+      </w:r>
+      <w:r>
+        <w:t xml:space="preserve"> </w:t>
+      </w:r>
+      <w:r>
+        <w:t xml:space="preserve">(1972)</w:t>
       </w:r>
     </w:p>
     <w:p>
@@ -9407,7 +9413,49 @@
           <w:iCs/>
           <w:i/>
         </w:rPr>
-        <w:t xml:space="preserve">Editora e ano a conferir na edição brasileira consultada.</w:t>
+        <w:t xml:space="preserve">Citações de autores traduzidas a partir do original. As edições brasileiras abaixo são indicadas para consulta; a redação delas pode diferir. Itens marcados</w:t>
+      </w:r>
+      <w:r>
+        <w:rPr>
+          <w:iCs/>
+          <w:i/>
+        </w:rPr>
+        <w:t xml:space="preserve"> </w:t>
+      </w:r>
+      <w:r>
+        <w:rPr>
+          <w:iCs/>
+          <w:i/>
+        </w:rPr>
+        <w:t xml:space="preserve">“</w:t>
+      </w:r>
+      <w:r>
+        <w:rPr>
+          <w:iCs/>
+          <w:i/>
+        </w:rPr>
+        <w:t xml:space="preserve">a conferir</w:t>
+      </w:r>
+      <w:r>
+        <w:rPr>
+          <w:iCs/>
+          <w:i/>
+        </w:rPr>
+        <w:t xml:space="preserve">”</w:t>
+      </w:r>
+      <w:r>
+        <w:rPr>
+          <w:iCs/>
+          <w:i/>
+        </w:rPr>
+        <w:t xml:space="preserve"> </w:t>
+      </w:r>
+      <w:r>
+        <w:rPr>
+          <w:iCs/>
+          <w:i/>
+        </w:rPr>
+        <w:t xml:space="preserve">não puderam ser confirmados.</w:t>
       </w:r>
     </w:p>
     <w:p>
@@ -9432,7 +9480,7 @@
         <w:t xml:space="preserve">O Deus Pródigo</w:t>
       </w:r>
       <w:r>
-        <w:t xml:space="preserve">.</w:t>
+        <w:t xml:space="preserve">. Thomas Nelson Brasil, 2016.</w:t>
       </w:r>
     </w:p>
     <w:p>
@@ -9457,7 +9505,7 @@
         <w:t xml:space="preserve">O Significado do Casamento</w:t>
       </w:r>
       <w:r>
-        <w:t xml:space="preserve">.</w:t>
+        <w:t xml:space="preserve">. Vida Nova, 2012.</w:t>
       </w:r>
     </w:p>
     <w:p>
@@ -9482,7 +9530,7 @@
         <w:t xml:space="preserve">A Anatomia de uma Dor</w:t>
       </w:r>
       <w:r>
-        <w:t xml:space="preserve">.</w:t>
+        <w:t xml:space="preserve">. (Editora e ano a conferir.)</w:t>
       </w:r>
     </w:p>
     <w:p>
@@ -9507,7 +9555,7 @@
         <w:t xml:space="preserve">Cartas de um Diabo a seu Aprendiz</w:t>
       </w:r>
       <w:r>
-        <w:t xml:space="preserve">.</w:t>
+        <w:t xml:space="preserve">. Thomas Nelson Brasil, 2017.</w:t>
       </w:r>
     </w:p>
     <w:p>
@@ -9532,7 +9580,7 @@
         <w:t xml:space="preserve">Os Quatro Amores</w:t>
       </w:r>
       <w:r>
-        <w:t xml:space="preserve">.</w:t>
+        <w:t xml:space="preserve">. Thomas Nelson Brasil, 2017.</w:t>
       </w:r>
     </w:p>
     <w:p>
@@ -9544,23 +9592,7 @@
         <w:pStyle w:val="Compact"/>
       </w:pPr>
       <w:r>
-        <w:t xml:space="preserve">TEN BOOM, Corrie.</w:t>
-      </w:r>
-      <w:r>
-        <w:t xml:space="preserve"> </w:t>
-      </w:r>
-      <w:r>
-        <w:rPr>
-          <w:iCs/>
-          <w:i/>
-        </w:rPr>
-        <w:t xml:space="preserve">Ainda aprendendo a perdoar</w:t>
-      </w:r>
-      <w:r>
-        <w:t xml:space="preserve"> </w:t>
-      </w:r>
-      <w:r>
-        <w:t xml:space="preserve">(relato publicado na revista</w:t>
+        <w:t xml:space="preserve">TEN BOOM, Corrie. Relato publicado na revista</w:t>
       </w:r>
       <w:r>
         <w:t xml:space="preserve"> </w:t>
@@ -9573,7 +9605,23 @@
         <w:t xml:space="preserve">Guideposts</w:t>
       </w:r>
       <w:r>
-        <w:t xml:space="preserve">, 1972).</w:t>
+        <w:t xml:space="preserve">, nov. 1972; também em</w:t>
+      </w:r>
+      <w:r>
+        <w:t xml:space="preserve"> </w:t>
+      </w:r>
+      <w:r>
+        <w:rPr>
+          <w:iCs/>
+          <w:i/>
+        </w:rPr>
+        <w:t xml:space="preserve">Tramp for the Lord</w:t>
+      </w:r>
+      <w:r>
+        <w:t xml:space="preserve"> </w:t>
+      </w:r>
+      <w:r>
+        <w:t xml:space="preserve">(sem edição brasileira confirmada).</w:t>
       </w:r>
     </w:p>
     <w:p>
@@ -9598,7 +9646,7 @@
         <w:t xml:space="preserve">À Procura de Deus</w:t>
       </w:r>
       <w:r>
-        <w:t xml:space="preserve">.</w:t>
+        <w:t xml:space="preserve">. (Editora e ano a conferir.)</w:t>
       </w:r>
     </w:p>
     <w:bookmarkEnd w:id="37"/>

</xml_diff>

<commit_message>
Autor Ricardo Carvalho Barbosa e página de créditos editoriais nos três livros
Co-Authored-By: Claude Opus 5.5 <noreply@anthropic.com>
Claude-Session: https://claude.ai/code/session_01LzW95iq837pNNELpWoCBLT
</commit_message>
<xml_diff>
--- a/livros/de-mulher-para-mulher/De-mulher-para-mulher.docx
+++ b/livros/de-mulher-para-mulher/De-mulher-para-mulher.docx
@@ -36,7 +36,7 @@
         <w:pStyle w:val="BodyText"/>
       </w:pPr>
       <w:r>
-        <w:t xml:space="preserve">[Nome do autor]</w:t>
+        <w:t xml:space="preserve">Ricardo Carvalho Barbosa</w:t>
       </w:r>
     </w:p>
     <w:p>
@@ -52,12 +52,56 @@
       </w:r>
     </w:p>
     <w:bookmarkEnd w:id="20"/>
-    <w:bookmarkStart w:id="21" w:name="prefácio"/>
+    <w:bookmarkStart w:id="21" w:name="créditos-editoriais"/>
     <w:p>
       <w:pPr>
         <w:pStyle w:val="Heading1"/>
       </w:pPr>
       <w:r>
+        <w:t xml:space="preserve">Créditos editoriais</w:t>
+      </w:r>
+    </w:p>
+    <w:p>
+      <w:pPr>
+        <w:pStyle w:val="FirstParagraph"/>
+      </w:pPr>
+      <w:r>
+        <w:rPr>
+          <w:bCs/>
+          <w:b/>
+        </w:rPr>
+        <w:t xml:space="preserve">Autor e responsável pelo projeto</w:t>
+      </w:r>
+      <w:r>
+        <w:br/>
+      </w:r>
+      <w:r>
+        <w:t xml:space="preserve">Ricardo Carvalho Barbosa</w:t>
+      </w:r>
+    </w:p>
+    <w:p>
+      <w:pPr>
+        <w:pStyle w:val="BodyText"/>
+      </w:pPr>
+      <w:r>
+        <w:t xml:space="preserve">ISNI: 0000 0005 3173 985X</w:t>
+      </w:r>
+    </w:p>
+    <w:p>
+      <w:pPr>
+        <w:pStyle w:val="BodyText"/>
+      </w:pPr>
+      <w:r>
+        <w:t xml:space="preserve">© 2026 Ricardo Carvalho Barbosa, quanto à seleção, organização e versão final do texto.</w:t>
+      </w:r>
+    </w:p>
+    <w:bookmarkEnd w:id="21"/>
+    <w:bookmarkStart w:id="22" w:name="prefácio"/>
+    <w:p>
+      <w:pPr>
+        <w:pStyle w:val="Heading1"/>
+      </w:pPr>
+      <w:r>
         <w:t xml:space="preserve">Prefácio</w:t>
       </w:r>
     </w:p>
@@ -167,8 +211,8 @@
         <w:t xml:space="preserve">Prepare o seu café. Eva quer conversar com você.</w:t>
       </w:r>
     </w:p>
-    <w:bookmarkEnd w:id="21"/>
-    <w:bookmarkStart w:id="22" w:name="introdução"/>
+    <w:bookmarkEnd w:id="22"/>
+    <w:bookmarkStart w:id="23" w:name="introdução"/>
     <w:p>
       <w:pPr>
         <w:pStyle w:val="Heading1"/>
@@ -289,8 +333,8 @@
         <w:t xml:space="preserve">Então, vamos começar pelo começo. Pelo dia em que eu nasci.</w:t>
       </w:r>
     </w:p>
-    <w:bookmarkEnd w:id="22"/>
-    <w:bookmarkStart w:id="23" w:name="capítulo-um-o-dia-em-que-eu-nasci"/>
+    <w:bookmarkEnd w:id="23"/>
+    <w:bookmarkStart w:id="24" w:name="capítulo-um-o-dia-em-que-eu-nasci"/>
     <w:p>
       <w:pPr>
         <w:pStyle w:val="Heading1"/>
@@ -1057,8 +1101,8 @@
         <w:t xml:space="preserve">— Efésios 2:10</w:t>
       </w:r>
     </w:p>
-    <w:bookmarkEnd w:id="23"/>
-    <w:bookmarkStart w:id="24" w:name="capítulo-dois-o-homem-que-me-esperava"/>
+    <w:bookmarkEnd w:id="24"/>
+    <w:bookmarkStart w:id="25" w:name="capítulo-dois-o-homem-que-me-esperava"/>
     <w:p>
       <w:pPr>
         <w:pStyle w:val="Heading1"/>
@@ -1948,8 +1992,8 @@
         <w:t xml:space="preserve">— João 2:5</w:t>
       </w:r>
     </w:p>
-    <w:bookmarkEnd w:id="24"/>
-    <w:bookmarkStart w:id="25" w:name="capítulo-três-as-minhas-tardes-com-deus"/>
+    <w:bookmarkEnd w:id="25"/>
+    <w:bookmarkStart w:id="26" w:name="capítulo-três-as-minhas-tardes-com-deus"/>
     <w:p>
       <w:pPr>
         <w:pStyle w:val="Heading1"/>
@@ -2654,8 +2698,8 @@
         <w:t xml:space="preserve">— Lucas 10:42</w:t>
       </w:r>
     </w:p>
-    <w:bookmarkEnd w:id="25"/>
-    <w:bookmarkStart w:id="26" w:name="X73c6eef013571513795b5aedad028e826017239"/>
+    <w:bookmarkEnd w:id="26"/>
+    <w:bookmarkStart w:id="27" w:name="X73c6eef013571513795b5aedad028e826017239"/>
     <w:p>
       <w:pPr>
         <w:pStyle w:val="Heading1"/>
@@ -3551,8 +3595,8 @@
         <w:t xml:space="preserve">— Mateus 4:4</w:t>
       </w:r>
     </w:p>
-    <w:bookmarkEnd w:id="26"/>
-    <w:bookmarkStart w:id="27" w:name="X0516382a2b3800abec748d347309815bfe8c3cb"/>
+    <w:bookmarkEnd w:id="27"/>
+    <w:bookmarkStart w:id="28" w:name="X0516382a2b3800abec748d347309815bfe8c3cb"/>
     <w:p>
       <w:pPr>
         <w:pStyle w:val="Heading1"/>
@@ -4517,8 +4561,8 @@
         <w:t xml:space="preserve">— Efésios 4:32</w:t>
       </w:r>
     </w:p>
-    <w:bookmarkEnd w:id="27"/>
-    <w:bookmarkStart w:id="28" w:name="capítulo-seis-vestida-pelas-mãos-dele"/>
+    <w:bookmarkEnd w:id="28"/>
+    <w:bookmarkStart w:id="29" w:name="capítulo-seis-vestida-pelas-mãos-dele"/>
     <w:p>
       <w:pPr>
         <w:pStyle w:val="Heading1"/>
@@ -5355,8 +5399,8 @@
         <w:t xml:space="preserve">— Isaías 61:10</w:t>
       </w:r>
     </w:p>
-    <w:bookmarkEnd w:id="28"/>
-    <w:bookmarkStart w:id="29" w:name="capítulo-sete-o-meu-primeiro-filho"/>
+    <w:bookmarkEnd w:id="29"/>
+    <w:bookmarkStart w:id="30" w:name="capítulo-sete-o-meu-primeiro-filho"/>
     <w:p>
       <w:pPr>
         <w:pStyle w:val="Heading1"/>
@@ -6249,8 +6293,8 @@
         <w:t xml:space="preserve">— Salmos 127:3</w:t>
       </w:r>
     </w:p>
-    <w:bookmarkEnd w:id="29"/>
-    <w:bookmarkStart w:id="30" w:name="Xa3552803a723bc1a410ed624729e4c083cb1421"/>
+    <w:bookmarkEnd w:id="30"/>
+    <w:bookmarkStart w:id="31" w:name="Xa3552803a723bc1a410ed624729e4c083cb1421"/>
     <w:p>
       <w:pPr>
         <w:pStyle w:val="Heading1"/>
@@ -6962,8 +7006,8 @@
         <w:t xml:space="preserve">— Lucas 15:31</w:t>
       </w:r>
     </w:p>
-    <w:bookmarkEnd w:id="30"/>
-    <w:bookmarkStart w:id="31" w:name="capítulo-nove-o-túmulo-que-eu-cavei"/>
+    <w:bookmarkEnd w:id="31"/>
+    <w:bookmarkStart w:id="32" w:name="capítulo-nove-o-túmulo-que-eu-cavei"/>
     <w:p>
       <w:pPr>
         <w:pStyle w:val="Heading1"/>
@@ -7830,8 +7874,8 @@
         <w:t xml:space="preserve">— João 11:35</w:t>
       </w:r>
     </w:p>
-    <w:bookmarkEnd w:id="31"/>
-    <w:bookmarkStart w:id="32" w:name="Xb30649a8f7c51c14cede8c32b2e3ffec8dbfa0e"/>
+    <w:bookmarkEnd w:id="32"/>
+    <w:bookmarkStart w:id="33" w:name="Xb30649a8f7c51c14cede8c32b2e3ffec8dbfa0e"/>
     <w:p>
       <w:pPr>
         <w:pStyle w:val="Heading1"/>
@@ -8563,8 +8607,8 @@
         <w:t xml:space="preserve">— Gênesis 4:26</w:t>
       </w:r>
     </w:p>
-    <w:bookmarkEnd w:id="32"/>
-    <w:bookmarkStart w:id="33" w:name="carta-ao-leitor"/>
+    <w:bookmarkEnd w:id="33"/>
+    <w:bookmarkStart w:id="34" w:name="carta-ao-leitor"/>
     <w:p>
       <w:pPr>
         <w:pStyle w:val="Heading1"/>
@@ -8687,8 +8731,8 @@
         <w:t xml:space="preserve">Eva</w:t>
       </w:r>
     </w:p>
-    <w:bookmarkEnd w:id="33"/>
-    <w:bookmarkStart w:id="35" w:name="conclusão"/>
+    <w:bookmarkEnd w:id="34"/>
+    <w:bookmarkStart w:id="36" w:name="conclusão"/>
     <w:p>
       <w:pPr>
         <w:pStyle w:val="Heading1"/>
@@ -8914,7 +8958,7 @@
         <w:t xml:space="preserve">Se você quiser, faça agora, com as suas próprias palavras ou com as palavras abaixo, uma oração simples.</w:t>
       </w:r>
     </w:p>
-    <w:bookmarkStart w:id="34" w:name="oração"/>
+    <w:bookmarkStart w:id="35" w:name="oração"/>
     <w:p>
       <w:pPr>
         <w:pStyle w:val="Heading2"/>
@@ -8963,9 +9007,9 @@
         <w:t xml:space="preserve">Amém.</w:t>
       </w:r>
     </w:p>
-    <w:bookmarkEnd w:id="34"/>
     <w:bookmarkEnd w:id="35"/>
-    <w:bookmarkStart w:id="36" w:name="referências-bíblicas"/>
+    <w:bookmarkEnd w:id="36"/>
+    <w:bookmarkStart w:id="37" w:name="referências-bíblicas"/>
     <w:p>
       <w:pPr>
         <w:pStyle w:val="Heading1"/>
@@ -9394,8 +9438,8 @@
         <w:t xml:space="preserve">Apocalipse 19:8; 21:4 — a noiva vestida de linho finíssimo; as lágrimas enxugadas</w:t>
       </w:r>
     </w:p>
-    <w:bookmarkEnd w:id="36"/>
-    <w:bookmarkStart w:id="37" w:name="referências-bibliográficas"/>
+    <w:bookmarkEnd w:id="37"/>
+    <w:bookmarkStart w:id="38" w:name="referências-bibliográficas"/>
     <w:p>
       <w:pPr>
         <w:pStyle w:val="Heading1"/>
@@ -9649,8 +9693,8 @@
         <w:t xml:space="preserve">. (Editora e ano a conferir.)</w:t>
       </w:r>
     </w:p>
-    <w:bookmarkEnd w:id="37"/>
-    <w:bookmarkStart w:id="38" w:name="da-mesma-coleção"/>
+    <w:bookmarkEnd w:id="38"/>
+    <w:bookmarkStart w:id="39" w:name="da-mesma-coleção"/>
     <w:p>
       <w:pPr>
         <w:pStyle w:val="Heading1"/>
@@ -9725,7 +9769,7 @@
         <w:t xml:space="preserve">— Eva conta a você a sua história, do primeiro dia à criação dos filhos.</w:t>
       </w:r>
     </w:p>
-    <w:bookmarkEnd w:id="38"/>
+    <w:bookmarkEnd w:id="39"/>
     <w:sectPr/>
   </w:body>
 </w:document>

</xml_diff>

<commit_message>
Revisão editorial: títulos de capítulo padronizados, hífen sem quebra, bibliografia fechada
- Gerador de PDF: pandoc sem quebra de linha no HTML (títulos dos caps. 4, 5
  e 10 saíam em linha única) e palavras com hífen sem quebra de linha.
- De mulher para mulher: promessa do Prefácio suavizada; Sl 139:13 não se
  repete no cap. 7.
- Bibliografias com edição, ano e ISBN; '(este volume)' na página da coleção.

Co-Authored-By: Claude Opus 5.5 <noreply@anthropic.com>
Claude-Session: https://claude.ai/code/session_01LzW95iq837pNNELpWoCBLT
</commit_message>
<xml_diff>
--- a/livros/de-mulher-para-mulher/De-mulher-para-mulher.docx
+++ b/livros/de-mulher-para-mulher/De-mulher-para-mulher.docx
@@ -184,7 +184,7 @@
         <w:pStyle w:val="BodyText"/>
       </w:pPr>
       <w:r>
-        <w:t xml:space="preserve">Tudo o que ela diz está ancorado na Bíblia. Quando Eva imagina ou lembra algo que a Bíblia não registra, ela mesma avisa. E, a cada capítulo, ela abre a Palavra de Deus com você, mostra onde Jesus aparece na sua história e termina com um conselho de mulher para mulher.</w:t>
+        <w:t xml:space="preserve">Tudo o que ela diz está ancorado na Bíblia. Nos momentos em que Eva imagina ou lembra algo importante que a Bíblia não registra, ela mesma avisa. E, a cada capítulo, ela abre a Palavra de Deus com você, mostra onde Jesus aparece na sua história e termina com um conselho de mulher para mulher.</w:t>
       </w:r>
     </w:p>
     <w:p>
@@ -5801,37 +5801,7 @@
         <w:pStyle w:val="BodyText"/>
       </w:pPr>
       <w:r>
-        <w:t xml:space="preserve">O mesmo Deus que me construiu no jardim tece cada criança no ventre. Davi diz:</w:t>
-      </w:r>
-      <w:r>
-        <w:t xml:space="preserve"> </w:t>
-      </w:r>
-      <w:r>
-        <w:rPr>
-          <w:iCs/>
-          <w:i/>
-        </w:rPr>
-        <w:t xml:space="preserve">“</w:t>
-      </w:r>
-      <w:r>
-        <w:rPr>
-          <w:iCs/>
-          <w:i/>
-        </w:rPr>
-        <w:t xml:space="preserve">Pois tu formaste o meu interior, tu me teceste no seio de minha mãe</w:t>
-      </w:r>
-      <w:r>
-        <w:rPr>
-          <w:iCs/>
-          <w:i/>
-        </w:rPr>
-        <w:t xml:space="preserve">”</w:t>
-      </w:r>
-      <w:r>
-        <w:t xml:space="preserve"> </w:t>
-      </w:r>
-      <w:r>
-        <w:t xml:space="preserve">(Salmos 139:13). Quando você está grávida, há um Artesão trabalhando dentro de você, com mais cuidado do que você imagina.</w:t>
+        <w:t xml:space="preserve">O mesmo Deus que me construiu no jardim tece cada criança no ventre, como Davi cantou (Salmos 139:13). Quando você está grávida, há um Artesão trabalhando dentro de você, com mais cuidado do que você imagina.</w:t>
       </w:r>
     </w:p>
     <w:p>
@@ -9524,7 +9494,7 @@
         <w:t xml:space="preserve">O Deus Pródigo</w:t>
       </w:r>
       <w:r>
-        <w:t xml:space="preserve">. Thomas Nelson Brasil, 2016.</w:t>
+        <w:t xml:space="preserve">: recuperando a essência da fé cristã. Thomas Nelson Brasil, 2016. ISBN 978-85-7860-867-5.</w:t>
       </w:r>
     </w:p>
     <w:p>
@@ -9574,7 +9544,7 @@
         <w:t xml:space="preserve">A Anatomia de uma Dor</w:t>
       </w:r>
       <w:r>
-        <w:t xml:space="preserve">. (Editora e ano a conferir.)</w:t>
+        <w:t xml:space="preserve">: um luto em observação. Tradução de Alípio Franca Correia Neto. Vida, 2007. ISBN 978-85-7367-859-8.</w:t>
       </w:r>
     </w:p>
     <w:p>
@@ -9599,7 +9569,7 @@
         <w:t xml:space="preserve">Cartas de um Diabo a seu Aprendiz</w:t>
       </w:r>
       <w:r>
-        <w:t xml:space="preserve">. Thomas Nelson Brasil, 2017.</w:t>
+        <w:t xml:space="preserve">. Thomas Nelson Brasil, 2017. ISBN 978-85-7860-184-3.</w:t>
       </w:r>
     </w:p>
     <w:p>
@@ -9624,7 +9594,7 @@
         <w:t xml:space="preserve">Os Quatro Amores</w:t>
       </w:r>
       <w:r>
-        <w:t xml:space="preserve">. Thomas Nelson Brasil, 2017.</w:t>
+        <w:t xml:space="preserve">. Thomas Nelson Brasil, 2017. ISBN 978-85-7860-195-9.</w:t>
       </w:r>
     </w:p>
     <w:p>
@@ -9690,7 +9660,7 @@
         <w:t xml:space="preserve">À Procura de Deus</w:t>
       </w:r>
       <w:r>
-        <w:t xml:space="preserve">. (Editora e ano a conferir.)</w:t>
+        <w:t xml:space="preserve">. Betânia, 2019. ISBN 978-85-358-0131-6.</w:t>
       </w:r>
     </w:p>
     <w:bookmarkEnd w:id="38"/>
@@ -9766,7 +9736,7 @@
         <w:t xml:space="preserve"> </w:t>
       </w:r>
       <w:r>
-        <w:t xml:space="preserve">— Eva conta a você a sua história, do primeiro dia à criação dos filhos.</w:t>
+        <w:t xml:space="preserve">(este volume) — Eva conta a você a sua história, do primeiro dia à criação dos filhos.</w:t>
       </w:r>
     </w:p>
     <w:bookmarkEnd w:id="39"/>

</xml_diff>

<commit_message>
De mulher para mulher: nota da bibliografia sem itens pendentes
Co-Authored-By: Claude Opus 5.5 <noreply@anthropic.com>
Claude-Session: https://claude.ai/code/session_01LzW95iq837pNNELpWoCBLT
</commit_message>
<xml_diff>
--- a/livros/de-mulher-para-mulher/De-mulher-para-mulher.docx
+++ b/livros/de-mulher-para-mulher/De-mulher-para-mulher.docx
@@ -9427,49 +9427,7 @@
           <w:iCs/>
           <w:i/>
         </w:rPr>
-        <w:t xml:space="preserve">Citações de autores traduzidas a partir do original. As edições brasileiras abaixo são indicadas para consulta; a redação delas pode diferir. Itens marcados</w:t>
-      </w:r>
-      <w:r>
-        <w:rPr>
-          <w:iCs/>
-          <w:i/>
-        </w:rPr>
-        <w:t xml:space="preserve"> </w:t>
-      </w:r>
-      <w:r>
-        <w:rPr>
-          <w:iCs/>
-          <w:i/>
-        </w:rPr>
-        <w:t xml:space="preserve">“</w:t>
-      </w:r>
-      <w:r>
-        <w:rPr>
-          <w:iCs/>
-          <w:i/>
-        </w:rPr>
-        <w:t xml:space="preserve">a conferir</w:t>
-      </w:r>
-      <w:r>
-        <w:rPr>
-          <w:iCs/>
-          <w:i/>
-        </w:rPr>
-        <w:t xml:space="preserve">”</w:t>
-      </w:r>
-      <w:r>
-        <w:rPr>
-          <w:iCs/>
-          <w:i/>
-        </w:rPr>
-        <w:t xml:space="preserve"> </w:t>
-      </w:r>
-      <w:r>
-        <w:rPr>
-          <w:iCs/>
-          <w:i/>
-        </w:rPr>
-        <w:t xml:space="preserve">não puderam ser confirmados.</w:t>
+        <w:t xml:space="preserve">Citações de autores traduzidas a partir do original. As edições brasileiras abaixo são indicadas para consulta; a redação delas pode diferir.</w:t>
       </w:r>
     </w:p>
     <w:p>

</xml_diff>